<commit_message>
feito algumas coreções finais
</commit_message>
<xml_diff>
--- a/Relatorio Sistema Academico.docx
+++ b/Relatorio Sistema Academico.docx
@@ -440,7 +440,7 @@
           <w:color w:val="000000"/>
         </w:rPr>
       </w:pPr>
-      <w:bookmarkStart w:colFirst="0" w:colLast="0" w:name="_l28npjwdjmzj" w:id="0"/>
+      <w:bookmarkStart w:colFirst="0" w:colLast="0" w:name="_vxpxtdz4zq7g" w:id="0"/>
       <w:bookmarkEnd w:id="0"/>
       <w:r>
         <w:rPr>
@@ -448,16 +448,11 @@
           <w:rtl w:val="0"/>
         </w:rPr>
         <w:t xml:space="preserve">Sumário</w:t>
-      </w:r>
-      <w:r>
-        <w:rPr>
-          <w:rtl w:val="0"/>
-        </w:rPr>
       </w:r>
     </w:p>
     <w:sdt>
       <w:sdtPr>
-        <w:id w:val="-2042175089"/>
+        <w:id w:val="320235932"/>
         <w:docPartObj>
           <w:docPartGallery w:val="Table of Contents"/>
           <w:docPartUnique w:val="1"/>
@@ -468,7 +463,7 @@
           <w:pPr>
             <w:widowControl w:val="0"/>
             <w:tabs>
-              <w:tab w:val="right" w:leader="dot" w:pos="12000"/>
+              <w:tab w:val="right" w:leader="none" w:pos="12000"/>
             </w:tabs>
             <w:spacing w:after="0" w:before="60" w:line="240" w:lineRule="auto"/>
             <w:rPr>
@@ -483,7 +478,7 @@
             <w:instrText xml:space="preserve"> TOC \h \u \z \t "Heading 1,1,Heading 2,2,Heading 3,3,Heading 4,4,Heading 5,5,Heading 6,6,"</w:instrText>
             <w:fldChar w:fldCharType="separate"/>
           </w:r>
-          <w:hyperlink w:anchor="_l28npjwdjmzj">
+          <w:hyperlink w:anchor="_vxpxtdz4zq7g">
             <w:r>
               <w:rPr>
                 <w:b w:val="1"/>
@@ -507,7 +502,7 @@
           <w:pPr>
             <w:widowControl w:val="0"/>
             <w:tabs>
-              <w:tab w:val="right" w:leader="dot" w:pos="12000"/>
+              <w:tab w:val="right" w:leader="none" w:pos="12000"/>
             </w:tabs>
             <w:spacing w:after="0" w:before="60" w:line="240" w:lineRule="auto"/>
             <w:rPr>
@@ -517,31 +512,24 @@
               <w:u w:val="none"/>
             </w:rPr>
           </w:pPr>
-          <w:hyperlink w:anchor="">
-            <w:r>
-              <w:rPr>
-                <w:b w:val="1"/>
-                <w:bCs w:val="1"/>
-                <w:color w:val="000000"/>
-                <w:u w:val="none"/>
-                <w:rtl w:val="0"/>
-              </w:rPr>
-              <w:t xml:space="preserve">1. Diário de bordo</w:t>
-              <w:tab/>
-              <w:t xml:space="preserve">3</w:t>
-            </w:r>
-          </w:hyperlink>
           <w:r>
             <w:rPr>
+              <w:b w:val="1"/>
+              <w:bCs w:val="1"/>
+              <w:color w:val="000000"/>
+              <w:u w:val="none"/>
               <w:rtl w:val="0"/>
             </w:rPr>
+            <w:t xml:space="preserve">1. Diário de bordo</w:t>
+            <w:tab/>
+            <w:t xml:space="preserve">3</w:t>
           </w:r>
         </w:p>
         <w:p>
           <w:pPr>
             <w:widowControl w:val="0"/>
             <w:tabs>
-              <w:tab w:val="right" w:leader="dot" w:pos="12000"/>
+              <w:tab w:val="right" w:leader="none" w:pos="12000"/>
             </w:tabs>
             <w:spacing w:after="0" w:before="60" w:line="240" w:lineRule="auto"/>
             <w:rPr>
@@ -551,31 +539,24 @@
               <w:u w:val="none"/>
             </w:rPr>
           </w:pPr>
-          <w:hyperlink w:anchor="">
-            <w:r>
-              <w:rPr>
-                <w:b w:val="1"/>
-                <w:bCs w:val="1"/>
-                <w:color w:val="000000"/>
-                <w:u w:val="none"/>
-                <w:rtl w:val="0"/>
-              </w:rPr>
-              <w:t xml:space="preserve">2. Dificuldades encontradas e soluções adotadas</w:t>
-              <w:tab/>
-              <w:t xml:space="preserve">4</w:t>
-            </w:r>
-          </w:hyperlink>
           <w:r>
             <w:rPr>
+              <w:b w:val="1"/>
+              <w:bCs w:val="1"/>
+              <w:color w:val="000000"/>
+              <w:u w:val="none"/>
               <w:rtl w:val="0"/>
             </w:rPr>
+            <w:t xml:space="preserve">2. Dificuldades encontradas e soluções adotadas</w:t>
+            <w:tab/>
+            <w:t xml:space="preserve">4</w:t>
           </w:r>
         </w:p>
         <w:p>
           <w:pPr>
             <w:widowControl w:val="0"/>
             <w:tabs>
-              <w:tab w:val="right" w:leader="dot" w:pos="12000"/>
+              <w:tab w:val="right" w:leader="none" w:pos="12000"/>
             </w:tabs>
             <w:spacing w:after="0" w:before="60" w:line="240" w:lineRule="auto"/>
             <w:rPr>
@@ -585,24 +566,17 @@
               <w:u w:val="none"/>
             </w:rPr>
           </w:pPr>
-          <w:hyperlink w:anchor="">
-            <w:r>
-              <w:rPr>
-                <w:b w:val="1"/>
-                <w:bCs w:val="1"/>
-                <w:color w:val="000000"/>
-                <w:u w:val="none"/>
-                <w:rtl w:val="0"/>
-              </w:rPr>
-              <w:t xml:space="preserve">3. Conclusão do grupo</w:t>
-              <w:tab/>
-              <w:t xml:space="preserve">5</w:t>
-            </w:r>
-          </w:hyperlink>
           <w:r>
             <w:rPr>
+              <w:b w:val="1"/>
+              <w:bCs w:val="1"/>
+              <w:color w:val="000000"/>
+              <w:u w:val="none"/>
               <w:rtl w:val="0"/>
             </w:rPr>
+            <w:t xml:space="preserve">3. Conclusão do grupo</w:t>
+            <w:tab/>
+            <w:t xml:space="preserve">5</w:t>
           </w:r>
           <w:r>
             <w:fldChar w:fldCharType="end"/>
@@ -710,7 +684,6 @@
             <w:pPr>
               <w:keepNext w:val="0"/>
               <w:keepLines w:val="0"/>
-              <w:pageBreakBefore w:val="0"/>
               <w:widowControl w:val="0"/>
               <w:pBdr>
                 <w:top w:space="0" w:sz="0" w:val="nil"/>
@@ -753,7 +726,6 @@
             <w:pPr>
               <w:keepNext w:val="0"/>
               <w:keepLines w:val="0"/>
-              <w:pageBreakBefore w:val="0"/>
               <w:widowControl w:val="0"/>
               <w:pBdr>
                 <w:top w:space="0" w:sz="0" w:val="nil"/>
@@ -796,7 +768,6 @@
             <w:pPr>
               <w:keepNext w:val="0"/>
               <w:keepLines w:val="0"/>
-              <w:pageBreakBefore w:val="0"/>
               <w:widowControl w:val="0"/>
               <w:pBdr>
                 <w:top w:space="0" w:sz="0" w:val="nil"/>
@@ -845,7 +816,6 @@
             <w:pPr>
               <w:keepNext w:val="0"/>
               <w:keepLines w:val="0"/>
-              <w:pageBreakBefore w:val="0"/>
               <w:widowControl w:val="0"/>
               <w:pBdr>
                 <w:top w:space="0" w:sz="0" w:val="nil"/>
@@ -883,7 +853,6 @@
             <w:pPr>
               <w:keepNext w:val="0"/>
               <w:keepLines w:val="0"/>
-              <w:pageBreakBefore w:val="0"/>
               <w:widowControl w:val="0"/>
               <w:pBdr>
                 <w:top w:space="0" w:sz="0" w:val="nil"/>
@@ -921,7 +890,6 @@
             <w:pPr>
               <w:keepNext w:val="0"/>
               <w:keepLines w:val="0"/>
-              <w:pageBreakBefore w:val="0"/>
               <w:widowControl w:val="0"/>
               <w:pBdr>
                 <w:top w:space="0" w:sz="0" w:val="nil"/>
@@ -965,7 +933,6 @@
             <w:pPr>
               <w:keepNext w:val="0"/>
               <w:keepLines w:val="0"/>
-              <w:pageBreakBefore w:val="0"/>
               <w:widowControl w:val="0"/>
               <w:pBdr>
                 <w:top w:space="0" w:sz="0" w:val="nil"/>
@@ -1016,7 +983,6 @@
             <w:pPr>
               <w:keepNext w:val="0"/>
               <w:keepLines w:val="0"/>
-              <w:pageBreakBefore w:val="0"/>
               <w:widowControl w:val="0"/>
               <w:pBdr>
                 <w:top w:space="0" w:sz="0" w:val="nil"/>
@@ -1066,7 +1032,6 @@
             <w:pPr>
               <w:keepNext w:val="0"/>
               <w:keepLines w:val="0"/>
-              <w:pageBreakBefore w:val="0"/>
               <w:widowControl w:val="0"/>
               <w:pBdr>
                 <w:top w:space="0" w:sz="0" w:val="nil"/>
@@ -1109,7 +1074,6 @@
             <w:pPr>
               <w:keepNext w:val="0"/>
               <w:keepLines w:val="0"/>
-              <w:pageBreakBefore w:val="0"/>
               <w:widowControl w:val="0"/>
               <w:pBdr>
                 <w:top w:space="0" w:sz="0" w:val="nil"/>
@@ -1147,7 +1111,6 @@
             <w:pPr>
               <w:keepNext w:val="0"/>
               <w:keepLines w:val="0"/>
-              <w:pageBreakBefore w:val="0"/>
               <w:widowControl w:val="0"/>
               <w:pBdr>
                 <w:top w:space="0" w:sz="0" w:val="nil"/>
@@ -1185,7 +1148,6 @@
             <w:pPr>
               <w:keepNext w:val="0"/>
               <w:keepLines w:val="0"/>
-              <w:pageBreakBefore w:val="0"/>
               <w:widowControl w:val="0"/>
               <w:pBdr>
                 <w:top w:space="0" w:sz="0" w:val="nil"/>
@@ -1229,7 +1191,6 @@
             <w:pPr>
               <w:keepNext w:val="0"/>
               <w:keepLines w:val="0"/>
-              <w:pageBreakBefore w:val="0"/>
               <w:widowControl w:val="0"/>
               <w:pBdr>
                 <w:top w:space="0" w:sz="0" w:val="nil"/>
@@ -1267,7 +1228,6 @@
             <w:pPr>
               <w:keepNext w:val="0"/>
               <w:keepLines w:val="0"/>
-              <w:pageBreakBefore w:val="0"/>
               <w:widowControl w:val="0"/>
               <w:pBdr>
                 <w:top w:space="0" w:sz="0" w:val="nil"/>
@@ -1336,7 +1296,6 @@
             <w:pPr>
               <w:keepNext w:val="0"/>
               <w:keepLines w:val="0"/>
-              <w:pageBreakBefore w:val="0"/>
               <w:widowControl w:val="0"/>
               <w:pBdr>
                 <w:top w:space="0" w:sz="0" w:val="nil"/>
@@ -1374,7 +1333,6 @@
             <w:pPr>
               <w:keepNext w:val="0"/>
               <w:keepLines w:val="0"/>
-              <w:pageBreakBefore w:val="0"/>
               <w:widowControl w:val="0"/>
               <w:pBdr>
                 <w:top w:space="0" w:sz="0" w:val="nil"/>
@@ -1412,26 +1370,25 @@
             <w:pPr>
               <w:keepNext w:val="0"/>
               <w:keepLines w:val="0"/>
-              <w:pageBreakBefore w:val="0"/>
-              <w:widowControl w:val="0"/>
-              <w:pBdr>
-                <w:top w:space="0" w:sz="0" w:val="nil"/>
-                <w:left w:space="0" w:sz="0" w:val="nil"/>
-                <w:bottom w:space="0" w:sz="0" w:val="nil"/>
-                <w:right w:space="0" w:sz="0" w:val="nil"/>
-                <w:between w:space="0" w:sz="0" w:val="nil"/>
-              </w:pBdr>
-              <w:shd w:fill="auto" w:val="clear"/>
-              <w:spacing w:after="0" w:before="0" w:line="240" w:lineRule="auto"/>
-              <w:ind w:left="0" w:right="0" w:firstLine="0"/>
-              <w:jc w:val="left"/>
-              <w:rPr/>
-            </w:pPr>
-            <w:r>
-              <w:rPr>
-                <w:rtl w:val="0"/>
-              </w:rPr>
-              <w:t xml:space="preserve">Gabriel Mansur</w:t>
+              <w:widowControl w:val="0"/>
+              <w:pBdr>
+                <w:top w:space="0" w:sz="0" w:val="nil"/>
+                <w:left w:space="0" w:sz="0" w:val="nil"/>
+                <w:bottom w:space="0" w:sz="0" w:val="nil"/>
+                <w:right w:space="0" w:sz="0" w:val="nil"/>
+                <w:between w:space="0" w:sz="0" w:val="nil"/>
+              </w:pBdr>
+              <w:shd w:fill="auto" w:val="clear"/>
+              <w:spacing w:after="0" w:before="0" w:line="240" w:lineRule="auto"/>
+              <w:ind w:left="0" w:right="0" w:firstLine="0"/>
+              <w:jc w:val="left"/>
+              <w:rPr/>
+            </w:pPr>
+            <w:r>
+              <w:rPr>
+                <w:rtl w:val="0"/>
+              </w:rPr>
+              <w:t xml:space="preserve">Gabriel Mansur,Natã Batista</w:t>
             </w:r>
           </w:p>
         </w:tc>
@@ -1456,7 +1413,6 @@
             <w:pPr>
               <w:keepNext w:val="0"/>
               <w:keepLines w:val="0"/>
-              <w:pageBreakBefore w:val="0"/>
               <w:widowControl w:val="0"/>
               <w:pBdr>
                 <w:top w:space="0" w:sz="0" w:val="nil"/>
@@ -1494,7 +1450,6 @@
             <w:pPr>
               <w:keepNext w:val="0"/>
               <w:keepLines w:val="0"/>
-              <w:pageBreakBefore w:val="0"/>
               <w:widowControl w:val="0"/>
               <w:pBdr>
                 <w:top w:space="0" w:sz="0" w:val="nil"/>
@@ -1532,26 +1487,25 @@
             <w:pPr>
               <w:keepNext w:val="0"/>
               <w:keepLines w:val="0"/>
-              <w:pageBreakBefore w:val="0"/>
-              <w:widowControl w:val="0"/>
-              <w:pBdr>
-                <w:top w:space="0" w:sz="0" w:val="nil"/>
-                <w:left w:space="0" w:sz="0" w:val="nil"/>
-                <w:bottom w:space="0" w:sz="0" w:val="nil"/>
-                <w:right w:space="0" w:sz="0" w:val="nil"/>
-                <w:between w:space="0" w:sz="0" w:val="nil"/>
-              </w:pBdr>
-              <w:shd w:fill="auto" w:val="clear"/>
-              <w:spacing w:after="0" w:before="0" w:line="240" w:lineRule="auto"/>
-              <w:ind w:left="0" w:right="0" w:firstLine="0"/>
-              <w:jc w:val="left"/>
-              <w:rPr/>
-            </w:pPr>
-            <w:r>
-              <w:rPr>
-                <w:rtl w:val="0"/>
-              </w:rPr>
-              <w:t xml:space="preserve">Gabriel Mansur</w:t>
+              <w:widowControl w:val="0"/>
+              <w:pBdr>
+                <w:top w:space="0" w:sz="0" w:val="nil"/>
+                <w:left w:space="0" w:sz="0" w:val="nil"/>
+                <w:bottom w:space="0" w:sz="0" w:val="nil"/>
+                <w:right w:space="0" w:sz="0" w:val="nil"/>
+                <w:between w:space="0" w:sz="0" w:val="nil"/>
+              </w:pBdr>
+              <w:shd w:fill="auto" w:val="clear"/>
+              <w:spacing w:after="0" w:before="0" w:line="240" w:lineRule="auto"/>
+              <w:ind w:left="0" w:right="0" w:firstLine="0"/>
+              <w:jc w:val="left"/>
+              <w:rPr/>
+            </w:pPr>
+            <w:r>
+              <w:rPr>
+                <w:rtl w:val="0"/>
+              </w:rPr>
+              <w:t xml:space="preserve">Gabriel Mansur,Natã Batista</w:t>
             </w:r>
           </w:p>
         </w:tc>
@@ -1576,7 +1530,6 @@
             <w:pPr>
               <w:keepNext w:val="0"/>
               <w:keepLines w:val="0"/>
-              <w:pageBreakBefore w:val="0"/>
               <w:widowControl w:val="0"/>
               <w:pBdr>
                 <w:top w:space="0" w:sz="0" w:val="nil"/>
@@ -1614,7 +1567,6 @@
             <w:pPr>
               <w:keepNext w:val="0"/>
               <w:keepLines w:val="0"/>
-              <w:pageBreakBefore w:val="0"/>
               <w:widowControl w:val="0"/>
               <w:pBdr>
                 <w:top w:space="0" w:sz="0" w:val="nil"/>
@@ -1652,26 +1604,25 @@
             <w:pPr>
               <w:keepNext w:val="0"/>
               <w:keepLines w:val="0"/>
-              <w:pageBreakBefore w:val="0"/>
-              <w:widowControl w:val="0"/>
-              <w:pBdr>
-                <w:top w:space="0" w:sz="0" w:val="nil"/>
-                <w:left w:space="0" w:sz="0" w:val="nil"/>
-                <w:bottom w:space="0" w:sz="0" w:val="nil"/>
-                <w:right w:space="0" w:sz="0" w:val="nil"/>
-                <w:between w:space="0" w:sz="0" w:val="nil"/>
-              </w:pBdr>
-              <w:shd w:fill="auto" w:val="clear"/>
-              <w:spacing w:after="0" w:before="0" w:line="240" w:lineRule="auto"/>
-              <w:ind w:left="0" w:right="0" w:firstLine="0"/>
-              <w:jc w:val="left"/>
-              <w:rPr/>
-            </w:pPr>
-            <w:r>
-              <w:rPr>
-                <w:rtl w:val="0"/>
-              </w:rPr>
-              <w:t xml:space="preserve">Natã Batista</w:t>
+              <w:widowControl w:val="0"/>
+              <w:pBdr>
+                <w:top w:space="0" w:sz="0" w:val="nil"/>
+                <w:left w:space="0" w:sz="0" w:val="nil"/>
+                <w:bottom w:space="0" w:sz="0" w:val="nil"/>
+                <w:right w:space="0" w:sz="0" w:val="nil"/>
+                <w:between w:space="0" w:sz="0" w:val="nil"/>
+              </w:pBdr>
+              <w:shd w:fill="auto" w:val="clear"/>
+              <w:spacing w:after="0" w:before="0" w:line="240" w:lineRule="auto"/>
+              <w:ind w:left="0" w:right="0" w:firstLine="0"/>
+              <w:jc w:val="left"/>
+              <w:rPr/>
+            </w:pPr>
+            <w:r>
+              <w:rPr>
+                <w:rtl w:val="0"/>
+              </w:rPr>
+              <w:t xml:space="preserve">Gabriel Mansur</w:t>
             </w:r>
           </w:p>
         </w:tc>
@@ -1696,7 +1647,6 @@
             <w:pPr>
               <w:keepNext w:val="0"/>
               <w:keepLines w:val="0"/>
-              <w:pageBreakBefore w:val="0"/>
               <w:widowControl w:val="0"/>
               <w:pBdr>
                 <w:top w:space="0" w:sz="0" w:val="nil"/>
@@ -1734,7 +1684,6 @@
             <w:pPr>
               <w:keepNext w:val="0"/>
               <w:keepLines w:val="0"/>
-              <w:pageBreakBefore w:val="0"/>
               <w:widowControl w:val="0"/>
               <w:pBdr>
                 <w:top w:space="0" w:sz="0" w:val="nil"/>
@@ -1772,26 +1721,25 @@
             <w:pPr>
               <w:keepNext w:val="0"/>
               <w:keepLines w:val="0"/>
-              <w:pageBreakBefore w:val="0"/>
-              <w:widowControl w:val="0"/>
-              <w:pBdr>
-                <w:top w:space="0" w:sz="0" w:val="nil"/>
-                <w:left w:space="0" w:sz="0" w:val="nil"/>
-                <w:bottom w:space="0" w:sz="0" w:val="nil"/>
-                <w:right w:space="0" w:sz="0" w:val="nil"/>
-                <w:between w:space="0" w:sz="0" w:val="nil"/>
-              </w:pBdr>
-              <w:shd w:fill="auto" w:val="clear"/>
-              <w:spacing w:after="0" w:before="0" w:line="240" w:lineRule="auto"/>
-              <w:ind w:left="0" w:right="0" w:firstLine="0"/>
-              <w:jc w:val="left"/>
-              <w:rPr/>
-            </w:pPr>
-            <w:r>
-              <w:rPr>
-                <w:rtl w:val="0"/>
-              </w:rPr>
-              <w:t xml:space="preserve">Natã Batista</w:t>
+              <w:widowControl w:val="0"/>
+              <w:pBdr>
+                <w:top w:space="0" w:sz="0" w:val="nil"/>
+                <w:left w:space="0" w:sz="0" w:val="nil"/>
+                <w:bottom w:space="0" w:sz="0" w:val="nil"/>
+                <w:right w:space="0" w:sz="0" w:val="nil"/>
+                <w:between w:space="0" w:sz="0" w:val="nil"/>
+              </w:pBdr>
+              <w:shd w:fill="auto" w:val="clear"/>
+              <w:spacing w:after="0" w:before="0" w:line="240" w:lineRule="auto"/>
+              <w:ind w:left="0" w:right="0" w:firstLine="0"/>
+              <w:jc w:val="left"/>
+              <w:rPr/>
+            </w:pPr>
+            <w:r>
+              <w:rPr>
+                <w:rtl w:val="0"/>
+              </w:rPr>
+              <w:t xml:space="preserve">Gabriel Mansur</w:t>
             </w:r>
           </w:p>
         </w:tc>
@@ -1816,7 +1764,6 @@
             <w:pPr>
               <w:keepNext w:val="0"/>
               <w:keepLines w:val="0"/>
-              <w:pageBreakBefore w:val="0"/>
               <w:widowControl w:val="0"/>
               <w:pBdr>
                 <w:top w:space="0" w:sz="0" w:val="nil"/>
@@ -1854,7 +1801,6 @@
             <w:pPr>
               <w:keepNext w:val="0"/>
               <w:keepLines w:val="0"/>
-              <w:pageBreakBefore w:val="0"/>
               <w:widowControl w:val="0"/>
               <w:pBdr>
                 <w:top w:space="0" w:sz="0" w:val="nil"/>
@@ -1892,7 +1838,6 @@
             <w:pPr>
               <w:keepNext w:val="0"/>
               <w:keepLines w:val="0"/>
-              <w:pageBreakBefore w:val="0"/>
               <w:widowControl w:val="0"/>
               <w:pBdr>
                 <w:top w:space="0" w:sz="0" w:val="nil"/>
@@ -1936,7 +1881,6 @@
             <w:pPr>
               <w:keepNext w:val="0"/>
               <w:keepLines w:val="0"/>
-              <w:pageBreakBefore w:val="0"/>
               <w:widowControl w:val="0"/>
               <w:pBdr>
                 <w:top w:space="0" w:sz="0" w:val="nil"/>
@@ -1974,7 +1918,6 @@
             <w:pPr>
               <w:keepNext w:val="0"/>
               <w:keepLines w:val="0"/>
-              <w:pageBreakBefore w:val="0"/>
               <w:widowControl w:val="0"/>
               <w:pBdr>
                 <w:top w:space="0" w:sz="0" w:val="nil"/>
@@ -2012,7 +1955,6 @@
             <w:pPr>
               <w:keepNext w:val="0"/>
               <w:keepLines w:val="0"/>
-              <w:pageBreakBefore w:val="0"/>
               <w:widowControl w:val="0"/>
               <w:pBdr>
                 <w:top w:space="0" w:sz="0" w:val="nil"/>
@@ -2056,7 +1998,6 @@
             <w:pPr>
               <w:keepNext w:val="0"/>
               <w:keepLines w:val="0"/>
-              <w:pageBreakBefore w:val="0"/>
               <w:widowControl w:val="0"/>
               <w:pBdr>
                 <w:top w:space="0" w:sz="0" w:val="nil"/>
@@ -2094,7 +2035,6 @@
             <w:pPr>
               <w:keepNext w:val="0"/>
               <w:keepLines w:val="0"/>
-              <w:pageBreakBefore w:val="0"/>
               <w:widowControl w:val="0"/>
               <w:pBdr>
                 <w:top w:space="0" w:sz="0" w:val="nil"/>
@@ -2132,7 +2072,6 @@
             <w:pPr>
               <w:keepNext w:val="0"/>
               <w:keepLines w:val="0"/>
-              <w:pageBreakBefore w:val="0"/>
               <w:widowControl w:val="0"/>
               <w:pBdr>
                 <w:top w:space="0" w:sz="0" w:val="nil"/>
@@ -2176,7 +2115,6 @@
             <w:pPr>
               <w:keepNext w:val="0"/>
               <w:keepLines w:val="0"/>
-              <w:pageBreakBefore w:val="0"/>
               <w:widowControl w:val="0"/>
               <w:pBdr>
                 <w:top w:space="0" w:sz="0" w:val="nil"/>
@@ -2214,7 +2152,6 @@
             <w:pPr>
               <w:keepNext w:val="0"/>
               <w:keepLines w:val="0"/>
-              <w:pageBreakBefore w:val="0"/>
               <w:widowControl w:val="0"/>
               <w:pBdr>
                 <w:top w:space="0" w:sz="0" w:val="nil"/>
@@ -2252,7 +2189,6 @@
             <w:pPr>
               <w:keepNext w:val="0"/>
               <w:keepLines w:val="0"/>
-              <w:pageBreakBefore w:val="0"/>
               <w:widowControl w:val="0"/>
               <w:pBdr>
                 <w:top w:space="0" w:sz="0" w:val="nil"/>

</xml_diff>